<commit_message>
Initial Commit of Robot HeadBall
</commit_message>
<xml_diff>
--- a/Notes/_Unreal Notes/Unreal Notes.docx
+++ b/Notes/_Unreal Notes/Unreal Notes.docx
@@ -342,6 +342,7 @@
         </w:numPr>
       </w:pPr>
       <w:r>
+        <w:lastRenderedPageBreak/>
         <w:t>Place solution in same library checkbox</w:t>
       </w:r>
     </w:p>
@@ -721,6 +722,7 @@
     </w:p>
     <w:p>
       <w:r>
+        <w:lastRenderedPageBreak/>
         <w:t>Clock Symbol in BP is an ASync task</w:t>
       </w:r>
     </w:p>
@@ -764,155 +766,155 @@
     </w:p>
     <w:p>
       <w:r>
+        <w:t>(play, eject, select, blueprint menu, convert selected actor to blueprint)</w:t>
+      </w:r>
+    </w:p>
+    <w:p/>
+    <w:p>
+      <w:r>
+        <w:t xml:space="preserve">Create Game Mode BP based on </w:t>
+      </w:r>
+      <w:r>
+        <w:t>C++</w:t>
+      </w:r>
+      <w:r>
+        <w:t xml:space="preserve"> class</w:t>
+      </w:r>
+    </w:p>
+    <w:p>
+      <w:r>
+        <w:t>(set BP Game Mode to default, with pawn BP)</w:t>
+      </w:r>
+    </w:p>
+    <w:p/>
+    <w:p>
+      <w:r>
+        <w:t>Create C++ class Actor Component - grabber</w:t>
+      </w:r>
+    </w:p>
+    <w:p/>
+    <w:p>
+      <w:r>
+        <w:t>Add Component to BP_Pawn, custom class, add grabber</w:t>
+      </w:r>
+    </w:p>
+    <w:p/>
+    <w:p>
+      <w:r>
+        <w:t>// Pseudo code back in Grabber .cpp //</w:t>
+      </w:r>
+    </w:p>
+    <w:p>
+      <w:r>
+        <w:t>// In Tick - get player view point //</w:t>
+      </w:r>
+    </w:p>
+    <w:p>
+      <w:r>
+        <w:t xml:space="preserve">declare FVector, FRotator, </w:t>
+      </w:r>
+    </w:p>
+    <w:p>
+      <w:r>
+        <w:t>pass in these to PlayerController::GetPlayerViewPoint()</w:t>
+      </w:r>
+    </w:p>
+    <w:p>
+      <w:r>
+        <w:t>#define OUT right below #includes</w:t>
+      </w:r>
+    </w:p>
+    <w:p/>
+    <w:p>
+      <w:r>
+        <w:t xml:space="preserve">// DrawDebug - simulate Ray Cast // </w:t>
+      </w:r>
+    </w:p>
+    <w:p>
+      <w:r>
+        <w:t>Declare float Reach, FVector LTStart, LTDirection, LTEnd</w:t>
+      </w:r>
+    </w:p>
+    <w:p>
+      <w:r>
+        <w:t>LineTraceStart = PlayerViewLocation</w:t>
+      </w:r>
+    </w:p>
+    <w:p>
+      <w:r>
+        <w:t>LineTraceDirection = PlayviewRotation.vector();</w:t>
+      </w:r>
+    </w:p>
+    <w:p>
+      <w:r>
+        <w:t>LineTraceEnd = LTStart + (LTDirection * Reach);</w:t>
+      </w:r>
+    </w:p>
+    <w:p>
+      <w:r>
+        <w:t>DrawDebugLine(GetWorld(), LTStart, LTEnd, FColor::Red, false, 0.0f, 0, 10.0f)</w:t>
+      </w:r>
+    </w:p>
+    <w:p>
+      <w:r>
+        <w:t>// last 4 params - persist line bool, time persist f, depth priority int, thickness f</w:t>
+      </w:r>
+    </w:p>
+    <w:p/>
+    <w:p>
+      <w:r>
+        <w:t>* Set Simulate physics on objects you want to be grab, set collision to physics, and overlap true</w:t>
+      </w:r>
+    </w:p>
+    <w:p>
+      <w:r>
+        <w:t>// LineTracebychannel will work but will ignore physics body filter</w:t>
+      </w:r>
+    </w:p>
+    <w:p>
+      <w:r>
+        <w:t>// FCollisionObjectQueryParams - Object Types Query interested (Object Trace Channel)</w:t>
+      </w:r>
+    </w:p>
+    <w:p>
+      <w:r>
+        <w:t>// FCollisionQueryParams - TraceParams(FName(TEXT("")), false, GetOwner())</w:t>
+      </w:r>
+    </w:p>
+    <w:p>
+      <w:r>
+        <w:t>// TraceParams (traceTag not hitTag, collisiontype(complex or simple), actor ignore)</w:t>
+      </w:r>
+    </w:p>
+    <w:p>
+      <w:r>
+        <w:t>// Use 5th override for ObjectQueryParams and 2nd override for QueryParams</w:t>
+      </w:r>
+    </w:p>
+    <w:p>
+      <w:r>
+        <w:t xml:space="preserve">// FCOQP vs FCQP – FCOQP looks for object trace channel (object type based on collision preset) for which the trace will hit and return actor that belongs to that object type and </w:t>
+      </w:r>
+    </w:p>
+    <w:p>
+      <w:r>
+        <w:t>Query Params is a struct for holding parameters defining collision functions (simple vs complex)</w:t>
+      </w:r>
+    </w:p>
+    <w:p/>
+    <w:p>
+      <w:r>
+        <w:t>Declare FHitResult HitResult, FCollisionQueryParam TraceParams</w:t>
+      </w:r>
+    </w:p>
+    <w:p>
+      <w:r>
+        <w:t xml:space="preserve">GetWorld()-&gt;LineTraceSingbleByObjectType(OUT Hit Result, LTStart, LTEnd, </w:t>
+      </w:r>
+    </w:p>
+    <w:p>
+      <w:r>
         <w:lastRenderedPageBreak/>
-        <w:t>(play, eject, select, blueprint menu, convert selected actor to blueprint)</w:t>
-      </w:r>
-    </w:p>
-    <w:p/>
-    <w:p>
-      <w:r>
-        <w:t xml:space="preserve">Create Game Mode BP based on </w:t>
-      </w:r>
-      <w:r>
-        <w:t>C++</w:t>
-      </w:r>
-      <w:r>
-        <w:t xml:space="preserve"> class</w:t>
-      </w:r>
-    </w:p>
-    <w:p>
-      <w:r>
-        <w:t>(set BP Game Mode to default, with pawn BP)</w:t>
-      </w:r>
-    </w:p>
-    <w:p/>
-    <w:p>
-      <w:r>
-        <w:t>Create C++ class Actor Component - grabber</w:t>
-      </w:r>
-    </w:p>
-    <w:p/>
-    <w:p>
-      <w:r>
-        <w:t>Add Component to BP_Pawn, custom class, add grabber</w:t>
-      </w:r>
-    </w:p>
-    <w:p/>
-    <w:p>
-      <w:r>
-        <w:t>// Pseudo code back in Grabber .cpp //</w:t>
-      </w:r>
-    </w:p>
-    <w:p>
-      <w:r>
-        <w:t>// In Tick - get player view point //</w:t>
-      </w:r>
-    </w:p>
-    <w:p>
-      <w:r>
-        <w:t xml:space="preserve">declare FVector, FRotator, </w:t>
-      </w:r>
-    </w:p>
-    <w:p>
-      <w:r>
-        <w:t>pass in these to PlayerController::GetPlayerViewPoint()</w:t>
-      </w:r>
-    </w:p>
-    <w:p>
-      <w:r>
-        <w:t>#define OUT right below #includes</w:t>
-      </w:r>
-    </w:p>
-    <w:p/>
-    <w:p>
-      <w:r>
-        <w:t xml:space="preserve">// DrawDebug - simulate Ray Cast // </w:t>
-      </w:r>
-    </w:p>
-    <w:p>
-      <w:r>
-        <w:t>Declare float Reach, FVector LTStart, LTDirection, LTEnd</w:t>
-      </w:r>
-    </w:p>
-    <w:p>
-      <w:r>
-        <w:t>LineTraceStart = PlayerViewLocation</w:t>
-      </w:r>
-    </w:p>
-    <w:p>
-      <w:r>
-        <w:t>LineTraceDirection = PlayviewRotation.vector();</w:t>
-      </w:r>
-    </w:p>
-    <w:p>
-      <w:r>
-        <w:t>LineTraceEnd = LTStart + (LTDirection * Reach);</w:t>
-      </w:r>
-    </w:p>
-    <w:p>
-      <w:r>
-        <w:t>DrawDebugLine(GetWorld(), LTStart, LTEnd, FColor::Red, false, 0.0f, 0, 10.0f)</w:t>
-      </w:r>
-    </w:p>
-    <w:p>
-      <w:r>
-        <w:t>// last 4 params - persist line bool, time persist f, depth priority int, thickness f</w:t>
-      </w:r>
-    </w:p>
-    <w:p/>
-    <w:p>
-      <w:r>
-        <w:t>* Set Simulate physics on objects you want to be grab, set collision to physics, and overlap true</w:t>
-      </w:r>
-    </w:p>
-    <w:p>
-      <w:r>
-        <w:t>// LineTracebychannel will work but will ignore physics body filter</w:t>
-      </w:r>
-    </w:p>
-    <w:p>
-      <w:r>
-        <w:t>// FCollisionObjectQueryParams - Object Types Query interested (Object Trace Channel)</w:t>
-      </w:r>
-    </w:p>
-    <w:p>
-      <w:r>
-        <w:t>// FCollisionQueryParams - TraceParams(FName(TEXT("")), false, GetOwner())</w:t>
-      </w:r>
-    </w:p>
-    <w:p>
-      <w:r>
-        <w:t>// TraceParams (traceTag not hitTag, collisiontype(complex or simple), actor ignore)</w:t>
-      </w:r>
-    </w:p>
-    <w:p>
-      <w:r>
-        <w:t>// Use 5th override for ObjectQueryParams and 2nd override for QueryParams</w:t>
-      </w:r>
-    </w:p>
-    <w:p>
-      <w:r>
-        <w:t xml:space="preserve">// FCOQP vs FCQP – FCOQP looks for object trace channel (object type based on collision preset) for which the trace will hit and return actor that belongs to that object type and </w:t>
-      </w:r>
-    </w:p>
-    <w:p>
-      <w:r>
-        <w:t>Query Params is a struct for holding parameters defining collision functions (simple vs complex)</w:t>
-      </w:r>
-    </w:p>
-    <w:p/>
-    <w:p>
-      <w:r>
-        <w:t>Declare FHitResult HitResult, FCollisionQueryParam TraceParams</w:t>
-      </w:r>
-    </w:p>
-    <w:p>
-      <w:r>
-        <w:t xml:space="preserve">GetWorld()-&gt;LineTraceSingbleByObjectType(OUT Hit Result, LTStart, LTEnd, </w:t>
-      </w:r>
-    </w:p>
-    <w:p>
-      <w:r>
         <w:t>FCollisionObjectQueryParam(ECollisionChannel::ECC_PhysicsBody), QueryParams)</w:t>
       </w:r>
     </w:p>
@@ -950,7 +952,6 @@
     </w:p>
     <w:p>
       <w:r>
-        <w:lastRenderedPageBreak/>
         <w:t>UPhysicsHandleComponent* PhysicsHandle = nullptr;</w:t>
       </w:r>
     </w:p>
@@ -1137,6 +1138,7 @@
         </w:rPr>
       </w:pPr>
       <w:r>
+        <w:lastRenderedPageBreak/>
         <w:t>Custom event, function calls, timelines, and add component nodes cannot be used</w:t>
       </w:r>
     </w:p>
@@ -1232,8 +1234,199 @@
         </w:rPr>
       </w:pPr>
       <w:r>
+        <w:t>Sender gets a reference to the receiver (usually on overlaps, ray casts, or get all actors of class).</w:t>
+      </w:r>
+    </w:p>
+    <w:p>
+      <w:pPr>
+        <w:numPr>
+          <w:ilvl w:val="0"/>
+          <w:numId w:val="2"/>
+        </w:numPr>
+        <w:rPr>
+          <w:b/>
+        </w:rPr>
+      </w:pPr>
+      <w:r>
+        <w:t xml:space="preserve">Once you get the receiver’s reference, cast to that reference’s class blueprint (via the cast node) to get access to that receiving blueprint’s functions and values. (drag off ref., type cast to &lt;BP&gt;). </w:t>
+      </w:r>
+    </w:p>
+    <w:p>
+      <w:pPr>
+        <w:rPr>
+          <w:b/>
+        </w:rPr>
+      </w:pPr>
+      <w:r>
+        <w:rPr>
+          <w:b/>
+        </w:rPr>
+        <w:t>Blueprint Interfaces</w:t>
+      </w:r>
+    </w:p>
+    <w:p>
+      <w:pPr>
+        <w:numPr>
+          <w:ilvl w:val="0"/>
+          <w:numId w:val="3"/>
+        </w:numPr>
+      </w:pPr>
+      <w:r>
+        <w:t>Sender needs a reference of the receiver to send the message (the reference drives who it is you are communicating to).</w:t>
+      </w:r>
+    </w:p>
+    <w:p>
+      <w:pPr>
+        <w:numPr>
+          <w:ilvl w:val="0"/>
+          <w:numId w:val="3"/>
+        </w:numPr>
+      </w:pPr>
+      <w:r>
+        <w:t>Interface sends out messages (through any asset, once Interface is created) to listening objects</w:t>
+      </w:r>
+    </w:p>
+    <w:p>
+      <w:pPr>
+        <w:numPr>
+          <w:ilvl w:val="0"/>
+          <w:numId w:val="3"/>
+        </w:numPr>
+      </w:pPr>
+      <w:r>
+        <w:rPr>
+          <w:i/>
+        </w:rPr>
+        <w:t>When to create a BP Interface</w:t>
+      </w:r>
+      <w:r>
+        <w:t>: The object sender doesn’t care what happens to the message once the receiver retrieves the signal (if the receiver implements the interface, then great, but if it doesn’t, it doesn’t matter because the sender’s job is over at that point).</w:t>
+      </w:r>
+    </w:p>
+    <w:p>
+      <w:pPr>
+        <w:numPr>
+          <w:ilvl w:val="0"/>
+          <w:numId w:val="3"/>
+        </w:numPr>
+      </w:pPr>
+      <w:r>
+        <w:rPr>
+          <w:i/>
+        </w:rPr>
+        <w:t>How to create a BP Interface</w:t>
+      </w:r>
+      <w:r>
+        <w:t>: Content Browser, right click, Blueprints submenu, BP Interface</w:t>
+      </w:r>
+    </w:p>
+    <w:p>
+      <w:pPr>
+        <w:numPr>
+          <w:ilvl w:val="0"/>
+          <w:numId w:val="3"/>
+        </w:numPr>
+      </w:pPr>
+      <w:r>
+        <w:rPr>
+          <w:i/>
+        </w:rPr>
+        <w:t>How to implement an interface on receiving class</w:t>
+      </w:r>
+      <w:r>
+        <w:t>: Receiving class of message needs to implements the interface in the Class Settings, add interface (Be sure to compile immediately after adding the interface to get access to it in receiving BP).</w:t>
+      </w:r>
+    </w:p>
+    <w:p>
+      <w:pPr>
+        <w:numPr>
+          <w:ilvl w:val="0"/>
+          <w:numId w:val="3"/>
+        </w:numPr>
+      </w:pPr>
+      <w:r>
+        <w:rPr>
+          <w:i/>
+        </w:rPr>
+        <w:t>How to use BP Interface on receiving class</w:t>
+      </w:r>
+      <w:r>
+        <w:t xml:space="preserve">: Once you have implemented the interface in class settings, you can just create an event by using the same name of the function defined inside of the BP Interface.    </w:t>
+      </w:r>
+    </w:p>
+    <w:p>
+      <w:r>
+        <w:rPr>
+          <w:b/>
+        </w:rPr>
+        <w:t>Event Dispatchers</w:t>
+      </w:r>
+    </w:p>
+    <w:p>
+      <w:pPr>
+        <w:numPr>
+          <w:ilvl w:val="0"/>
+          <w:numId w:val="2"/>
+        </w:numPr>
+      </w:pPr>
+      <w:r>
+        <w:t>(Listener) – think Twitter</w:t>
+      </w:r>
+    </w:p>
+    <w:p>
+      <w:pPr>
+        <w:numPr>
+          <w:ilvl w:val="0"/>
+          <w:numId w:val="2"/>
+        </w:numPr>
+      </w:pPr>
+      <w:r>
+        <w:t>Communication between one sending BP/class to many receiving BPs/classes (typically many receivers, but none are required).</w:t>
+      </w:r>
+    </w:p>
+    <w:p>
+      <w:pPr>
+        <w:numPr>
+          <w:ilvl w:val="0"/>
+          <w:numId w:val="2"/>
+        </w:numPr>
+      </w:pPr>
+      <w:r>
+        <w:t>Dispatcher allows you to hook up the logic from the receiver, "listen for this event from that sender”.</w:t>
+      </w:r>
+    </w:p>
+    <w:p>
+      <w:pPr>
+        <w:numPr>
+          <w:ilvl w:val="0"/>
+          <w:numId w:val="2"/>
+        </w:numPr>
+      </w:pPr>
+      <w:r>
+        <w:t>Unlike a BP Interface, the sender doesn’t bother with a reference of the receiver; it’s just going to make a call to whomever is listening</w:t>
+      </w:r>
+    </w:p>
+    <w:p>
+      <w:pPr>
+        <w:numPr>
+          <w:ilvl w:val="0"/>
+          <w:numId w:val="2"/>
+        </w:numPr>
+      </w:pPr>
+      <w:r>
+        <w:t>On the other hand, the receiver needs a reference from the sender.</w:t>
+      </w:r>
+    </w:p>
+    <w:p>
+      <w:pPr>
+        <w:numPr>
+          <w:ilvl w:val="0"/>
+          <w:numId w:val="2"/>
+        </w:numPr>
+      </w:pPr>
+      <w:r>
         <w:lastRenderedPageBreak/>
-        <w:t>Sender gets a reference to the receiver (usually on overlaps, ray casts, or get all actors of class).</w:t>
+        <w:t>Once the receiving BP receives that reference (via a cast, or whatever), it assigns or binds a custom event, which then performs some logic.</w:t>
       </w:r>
     </w:p>
     <w:p>
@@ -1242,123 +1435,9 @@
           <w:ilvl w:val="0"/>
           <w:numId w:val="2"/>
         </w:numPr>
-        <w:rPr>
-          <w:b/>
-        </w:rPr>
-      </w:pPr>
-      <w:r>
-        <w:t xml:space="preserve">Once you get the receiver’s reference, cast to that reference’s class blueprint (via the cast node) to get access to that receiving blueprint’s functions and values. (drag off ref., type cast to &lt;BP&gt;). </w:t>
-      </w:r>
-    </w:p>
-    <w:p>
-      <w:pPr>
-        <w:rPr>
-          <w:b/>
-        </w:rPr>
-      </w:pPr>
-      <w:r>
-        <w:rPr>
-          <w:b/>
-        </w:rPr>
-        <w:t>Blueprint Interfaces</w:t>
-      </w:r>
-    </w:p>
-    <w:p>
-      <w:pPr>
-        <w:numPr>
-          <w:ilvl w:val="0"/>
-          <w:numId w:val="3"/>
-        </w:numPr>
-      </w:pPr>
-      <w:r>
-        <w:t>Sender needs a reference of the receiver to send the message (the reference drives who it is you are communicating to).</w:t>
-      </w:r>
-    </w:p>
-    <w:p>
-      <w:pPr>
-        <w:numPr>
-          <w:ilvl w:val="0"/>
-          <w:numId w:val="3"/>
-        </w:numPr>
-      </w:pPr>
-      <w:r>
-        <w:t>Interface sends out messages (through any asset, once Interface is created) to listening objects</w:t>
-      </w:r>
-    </w:p>
-    <w:p>
-      <w:pPr>
-        <w:numPr>
-          <w:ilvl w:val="0"/>
-          <w:numId w:val="3"/>
-        </w:numPr>
-      </w:pPr>
-      <w:r>
-        <w:rPr>
-          <w:i/>
-        </w:rPr>
-        <w:t>When to create a BP Interface</w:t>
-      </w:r>
-      <w:r>
-        <w:t>: The object sender doesn’t care what happens to the message once the receiver retrieves the signal (if the receiver implements the interface, then great, but if it doesn’t, it doesn’t matter because the sender’s job is over at that point).</w:t>
-      </w:r>
-    </w:p>
-    <w:p>
-      <w:pPr>
-        <w:numPr>
-          <w:ilvl w:val="0"/>
-          <w:numId w:val="3"/>
-        </w:numPr>
-      </w:pPr>
-      <w:r>
-        <w:rPr>
-          <w:i/>
-        </w:rPr>
-        <w:t>How to create a BP Interface</w:t>
-      </w:r>
-      <w:r>
-        <w:t>: Content Browser, right click, Blueprints submenu, BP Interface</w:t>
-      </w:r>
-    </w:p>
-    <w:p>
-      <w:pPr>
-        <w:numPr>
-          <w:ilvl w:val="0"/>
-          <w:numId w:val="3"/>
-        </w:numPr>
-      </w:pPr>
-      <w:r>
-        <w:rPr>
-          <w:i/>
-        </w:rPr>
-        <w:t>How to implement an interface on receiving class</w:t>
-      </w:r>
-      <w:r>
-        <w:t>: Receiving class of message needs to implements the interface in the Class Settings, add interface (Be sure to compile immediately after adding the interface to get access to it in receiving BP).</w:t>
-      </w:r>
-    </w:p>
-    <w:p>
-      <w:pPr>
-        <w:numPr>
-          <w:ilvl w:val="0"/>
-          <w:numId w:val="3"/>
-        </w:numPr>
-      </w:pPr>
-      <w:r>
-        <w:rPr>
-          <w:i/>
-        </w:rPr>
-        <w:t>How to use BP Interface on receiving class</w:t>
-      </w:r>
-      <w:r>
-        <w:t xml:space="preserve">: Once you have implemented the interface in class settings, you can just create an event by using the same name of the function defined inside of the BP Interface.    </w:t>
-      </w:r>
-    </w:p>
-    <w:p>
-      <w:r>
-        <w:rPr>
-          <w:b/>
-        </w:rPr>
-        <w:t>Event Dispatchers</w:t>
+      </w:pPr>
+      <w:r>
+        <w:t>Even though the receiver is doing the bulk of the work, the sender is the one making the call, so the sending BP/class is the place where you create the Event Dispatcher (directly below variables section of the blueprint panel inside of a blueprint).</w:t>
       </w:r>
     </w:p>
     <w:p>
@@ -1369,7 +1448,7 @@
         </w:numPr>
       </w:pPr>
       <w:r>
-        <w:t>(Listener) – think Twitter</w:t>
+        <w:t>One source - all object executes</w:t>
       </w:r>
     </w:p>
     <w:p>
@@ -1380,7 +1459,7 @@
         </w:numPr>
       </w:pPr>
       <w:r>
-        <w:t>Communication between one sending BP/class to many receiving BPs/classes (typically many receivers, but none are required).</w:t>
+        <w:t>The source does not need to know all targets, only targets need to know, which means you can dynamically spawn and destroy targets and retain control over them.</w:t>
       </w:r>
     </w:p>
     <w:p>
@@ -1391,88 +1470,7 @@
         </w:numPr>
       </w:pPr>
       <w:r>
-        <w:t>Dispatcher allows you to hook up the logic from the receiver, "listen for this event from that sender”.</w:t>
-      </w:r>
-    </w:p>
-    <w:p>
-      <w:pPr>
-        <w:numPr>
-          <w:ilvl w:val="0"/>
-          <w:numId w:val="2"/>
-        </w:numPr>
-      </w:pPr>
-      <w:r>
-        <w:t>Unlike a BP Interface, the sender doesn’t bother with a reference of the receiver; it’s just going to make a call to whomever is listening</w:t>
-      </w:r>
-    </w:p>
-    <w:p>
-      <w:pPr>
-        <w:numPr>
-          <w:ilvl w:val="0"/>
-          <w:numId w:val="2"/>
-        </w:numPr>
-      </w:pPr>
-      <w:r>
-        <w:t>On the other hand, the receiver needs a reference from the sender.</w:t>
-      </w:r>
-    </w:p>
-    <w:p>
-      <w:pPr>
-        <w:numPr>
-          <w:ilvl w:val="0"/>
-          <w:numId w:val="2"/>
-        </w:numPr>
-      </w:pPr>
-      <w:r>
-        <w:t>Once the receiving BP receives that reference (via a cast, or whatever), it assigns or binds a custom event, which then performs some logic.</w:t>
-      </w:r>
-    </w:p>
-    <w:p>
-      <w:pPr>
-        <w:numPr>
-          <w:ilvl w:val="0"/>
-          <w:numId w:val="2"/>
-        </w:numPr>
-      </w:pPr>
-      <w:r>
-        <w:t>Even though the receiver is doing the bulk of the work, the sender is the one making the call, so the sending BP/class is the place where you create the Event Dispatcher (directly below variables section of the blueprint panel inside of a blueprint).</w:t>
-      </w:r>
-    </w:p>
-    <w:p>
-      <w:pPr>
-        <w:numPr>
-          <w:ilvl w:val="0"/>
-          <w:numId w:val="2"/>
-        </w:numPr>
-      </w:pPr>
-      <w:r>
-        <w:t>One source - all object executes</w:t>
-      </w:r>
-    </w:p>
-    <w:p>
-      <w:pPr>
-        <w:numPr>
-          <w:ilvl w:val="0"/>
-          <w:numId w:val="2"/>
-        </w:numPr>
-      </w:pPr>
-      <w:r>
-        <w:t>The source does not need to know all targets, only targets need to know, which means you can dynamically spawn and destroy targets and retain control over them.</w:t>
-      </w:r>
-    </w:p>
-    <w:p>
-      <w:pPr>
-        <w:numPr>
-          <w:ilvl w:val="0"/>
-          <w:numId w:val="2"/>
-        </w:numPr>
-      </w:pPr>
-      <w:r>
-        <w:t xml:space="preserve">A common example would be to create an Event Dispatcher on your player character blueprint for an interaction key press.  Create a key press event (like ‘E’), and all you need to do is drag your dispatcher onto the graph, drop it, and set it as a ‘call’.  Then, for each other BP/class that you want to use a single key press (like ‘E’) to perform some </w:t>
-      </w:r>
-      <w:r>
-        <w:lastRenderedPageBreak/>
-        <w:t>specific logic (like toggle light, open door), all you need to do is cast to your player character on event begin play.  From there, drag off your player character cast node’s return actor pin and type the name of dispatcher you just created.  Select Assign &lt;name of your dispatcher&gt;.  Then name your custom event, and create some interact functionality for that specific BP/class.</w:t>
+        <w:t>A common example would be to create an Event Dispatcher on your player character blueprint for an interaction key press.  Create a key press event (like ‘E’), and all you need to do is drag your dispatcher onto the graph, drop it, and set it as a ‘call’.  Then, for each other BP/class that you want to use a single key press (like ‘E’) to perform some specific logic (like toggle light, open door), all you need to do is cast to your player character on event begin play.  From there, drag off your player character cast node’s return actor pin and type the name of dispatcher you just created.  Select Assign &lt;name of your dispatcher&gt;.  Then name your custom event, and create some interact functionality for that specific BP/class.</w:t>
       </w:r>
     </w:p>
     <w:p/>
@@ -1499,10 +1497,10 @@
             <v:path o:extrusionok="f" gradientshapeok="t" o:connecttype="rect"/>
             <o:lock v:ext="edit" aspectratio="t"/>
           </v:shapetype>
-          <v:shape id="_x0000_i1025" type="#_x0000_t75" style="width:469.5pt;height:201pt" o:ole="">
+          <v:shape id="_x0000_i1025" type="#_x0000_t75" style="width:469.3pt;height:201pt" o:ole="">
             <v:imagedata r:id="rId5" o:title=""/>
           </v:shape>
-          <o:OLEObject Type="Embed" ProgID="Photoshop.Image.16" ShapeID="_x0000_i1025" DrawAspect="Content" ObjectID="_1800168968" r:id="rId6">
+          <o:OLEObject Type="Embed" ProgID="Photoshop.Image.16" ShapeID="_x0000_i1025" DrawAspect="Content" ObjectID="_1804245403" r:id="rId6">
             <o:FieldCodes>\s</o:FieldCodes>
           </o:OLEObject>
         </w:object>
@@ -1575,6 +1573,7 @@
         </w:numPr>
       </w:pPr>
       <w:r>
+        <w:lastRenderedPageBreak/>
         <w:t>When you want to communicate to multiple objects with same class - get all actors of class, cast to and call function in loop (but interfaces are more elegant and flexible here)</w:t>
       </w:r>
     </w:p>
@@ -1585,11 +1584,11 @@
         <w:tblLook w:val="04A0" w:firstRow="1" w:lastRow="0" w:firstColumn="1" w:lastColumn="0" w:noHBand="0" w:noVBand="1"/>
       </w:tblPr>
       <w:tblGrid>
-        <w:gridCol w:w="3038"/>
-        <w:gridCol w:w="1247"/>
-        <w:gridCol w:w="922"/>
-        <w:gridCol w:w="1012"/>
-        <w:gridCol w:w="2031"/>
+        <w:gridCol w:w="3008"/>
+        <w:gridCol w:w="1274"/>
+        <w:gridCol w:w="933"/>
+        <w:gridCol w:w="1008"/>
+        <w:gridCol w:w="2027"/>
       </w:tblGrid>
       <w:tr>
         <w:trPr>
@@ -2296,7 +2295,6 @@
     <w:p/>
     <w:p>
       <w:r>
-        <w:lastRenderedPageBreak/>
         <w:t>* </w:t>
       </w:r>
       <w:r>
@@ -2309,7 +2307,6 @@
     </w:p>
     <w:p/>
     <w:p/>
-    <w:p/>
     <w:p>
       <w:pPr>
         <w:rPr>
@@ -2470,6 +2467,7 @@
         <w:spacing w:after="160" w:line="259" w:lineRule="auto"/>
       </w:pPr>
       <w:r>
+        <w:lastRenderedPageBreak/>
         <w:t>Instead of vector parameter for a flat color, add two texture sample nodes</w:t>
       </w:r>
     </w:p>
@@ -2599,8 +2597,595 @@
     </w:p>
     <w:p>
       <w:r>
+        <w:t>Adding Custom Fonts (be sure to read the copy write license):</w:t>
+      </w:r>
+    </w:p>
+    <w:p>
+      <w:pPr>
+        <w:pStyle w:val="ListParagraph"/>
+        <w:numPr>
+          <w:ilvl w:val="0"/>
+          <w:numId w:val="1"/>
+        </w:numPr>
+        <w:spacing w:after="160" w:line="259" w:lineRule="auto"/>
+      </w:pPr>
+      <w:r>
+        <w:t>Dafont.com, download font, unzip.</w:t>
+      </w:r>
+    </w:p>
+    <w:p>
+      <w:pPr>
+        <w:pStyle w:val="ListParagraph"/>
+        <w:numPr>
+          <w:ilvl w:val="0"/>
+          <w:numId w:val="1"/>
+        </w:numPr>
+        <w:spacing w:after="160" w:line="259" w:lineRule="auto"/>
+      </w:pPr>
+      <w:r>
+        <w:t>Import ttf into a folder in unreal by selecting the import button top of content browser</w:t>
+      </w:r>
+    </w:p>
+    <w:p>
+      <w:pPr>
+        <w:pStyle w:val="ListParagraph"/>
+        <w:numPr>
+          <w:ilvl w:val="0"/>
+          <w:numId w:val="1"/>
+        </w:numPr>
+        <w:spacing w:after="160" w:line="259" w:lineRule="auto"/>
+      </w:pPr>
+      <w:r>
+        <w:t>Change the font to the imported font in the Widget Blueprint, under text in details panel.</w:t>
+      </w:r>
+    </w:p>
+    <w:p/>
+    <w:p>
+      <w:r>
+        <w:t>Expose a variable to set that on the instance.</w:t>
+      </w:r>
+    </w:p>
+    <w:p>
+      <w:r>
+        <w:t>[Random Unit Vector] * a float value like 100 to make a random transform.</w:t>
+      </w:r>
+    </w:p>
+    <w:p>
+      <w:r>
+        <w:t>Add Static Mesh Component in a for loop in constructor for randomly generated content</w:t>
+      </w:r>
+    </w:p>
+    <w:p/>
+    <w:p/>
+    <w:p>
+      <w:pPr>
+        <w:rPr>
+          <w:u w:val="single"/>
+        </w:rPr>
+      </w:pPr>
+      <w:r>
+        <w:rPr>
+          <w:u w:val="single"/>
+        </w:rPr>
+        <w:t>Engine side before Game Project is loaded</w:t>
+      </w:r>
+    </w:p>
+    <w:p>
+      <w:r>
+        <w:t>Local Player - the person looking at screen. engine object, doesn't exist within the game world / game code.</w:t>
+      </w:r>
+    </w:p>
+    <w:p>
+      <w:r>
+        <w:t>GameViewPortClient - the screen itself, high level interface for rendering, connects user to engine</w:t>
+      </w:r>
+    </w:p>
+    <w:p>
+      <w:r>
+        <w:t>GameInstance is specific to project - used to be handled by engine.</w:t>
+      </w:r>
+    </w:p>
+    <w:p/>
+    <w:p>
+      <w:pPr>
+        <w:rPr>
+          <w:b/>
+          <w:bCs/>
+          <w:u w:val="single"/>
+        </w:rPr>
+      </w:pPr>
+      <w:r>
+        <w:rPr>
+          <w:b/>
+          <w:bCs/>
+          <w:u w:val="single"/>
+        </w:rPr>
+        <w:t>Unreal Engine Framework</w:t>
+      </w:r>
+    </w:p>
+    <w:p/>
+    <w:p>
+      <w:r>
+        <w:rPr>
+          <w:b/>
+          <w:bCs/>
+        </w:rPr>
+        <w:t>Game Instance</w:t>
+      </w:r>
+      <w:r>
+        <w:t xml:space="preserve"> - Persistent lifetime while engine is looping</w:t>
+      </w:r>
+      <w:r>
+        <w:t>.  If you don’t need to do any functionality or collect data before a game map is loaded, you likely don’t need a custom game instance class.</w:t>
+      </w:r>
+      <w:r>
+        <w:t xml:space="preserve">  </w:t>
+      </w:r>
+      <w:r>
+        <w:t xml:space="preserve">GameInstance stores </w:t>
+      </w:r>
+      <w:r>
+        <w:t xml:space="preserve"> </w:t>
+      </w:r>
+      <w:r>
+        <w:t>data between levels.</w:t>
+      </w:r>
+    </w:p>
+    <w:p>
+      <w:r>
+        <w:rPr>
+          <w:b/>
+          <w:bCs/>
+        </w:rPr>
         <w:lastRenderedPageBreak/>
-        <w:t>Adding Custom Fonts (be sure to read the copy write license):</w:t>
+        <w:t xml:space="preserve">Game </w:t>
+      </w:r>
+      <w:r>
+        <w:rPr>
+          <w:b/>
+          <w:bCs/>
+        </w:rPr>
+        <w:t>Instance</w:t>
+      </w:r>
+      <w:r>
+        <w:t xml:space="preserve"> </w:t>
+      </w:r>
+      <w:r>
+        <w:t xml:space="preserve"> - </w:t>
+      </w:r>
+      <w:r>
+        <w:t>Each player has their own unique Game Instance – client side.  No use using RPCs</w:t>
+      </w:r>
+      <w:r>
+        <w:t xml:space="preserve"> or anything that you want all clients to know in the GameInstance because it’s instanced per player, so nobody else will see what is in your game instance.</w:t>
+      </w:r>
+    </w:p>
+    <w:p/>
+    <w:p/>
+    <w:p>
+      <w:r>
+        <w:rPr>
+          <w:b/>
+          <w:bCs/>
+        </w:rPr>
+        <w:t>UEngine::LoadMap()</w:t>
+      </w:r>
+      <w:r>
+        <w:t xml:space="preserve"> – Occurs while loading game module, loads everything below in order</w:t>
+      </w:r>
+    </w:p>
+    <w:p/>
+    <w:p>
+      <w:r>
+        <w:t>---------      After Map is loaded    --------</w:t>
+      </w:r>
+    </w:p>
+    <w:p>
+      <w:r>
+        <w:rPr>
+          <w:b/>
+          <w:bCs/>
+        </w:rPr>
+        <w:t>Game Mode</w:t>
+      </w:r>
+      <w:r>
+        <w:t xml:space="preserve"> - Rules of the Game. Authority for what exists in the game, and its Server-Side.</w:t>
+      </w:r>
+      <w:r>
+        <w:t xml:space="preserve">  Makes server side-authoritative decisions related to game flow.</w:t>
+      </w:r>
+    </w:p>
+    <w:p/>
+    <w:p>
+      <w:r>
+        <w:rPr>
+          <w:b/>
+          <w:bCs/>
+        </w:rPr>
+        <w:t>GameMode</w:t>
+      </w:r>
+      <w:r>
+        <w:t xml:space="preserve"> </w:t>
+      </w:r>
+      <w:r>
+        <w:rPr>
+          <w:i/>
+          <w:iCs/>
+        </w:rPr>
+        <w:t>-&gt; InitGame</w:t>
+      </w:r>
+      <w:r>
+        <w:t xml:space="preserve"> ( creates GameSession),, </w:t>
+      </w:r>
+      <w:r>
+        <w:rPr>
+          <w:i/>
+          <w:iCs/>
+        </w:rPr>
+        <w:t>GameState</w:t>
+      </w:r>
+      <w:r>
+        <w:t>, Preinitializers components, and Starts Play.</w:t>
+      </w:r>
+      <w:r>
+        <w:t xml:space="preserve">  </w:t>
+      </w:r>
+      <w:r>
+        <w:rPr>
+          <w:b/>
+          <w:bCs/>
+        </w:rPr>
+        <w:t>InitGame</w:t>
+      </w:r>
+      <w:r>
+        <w:t xml:space="preserve"> - calls create GameSession.</w:t>
+      </w:r>
+    </w:p>
+    <w:p>
+      <w:pPr>
+        <w:rPr>
+          <w:b/>
+          <w:bCs/>
+        </w:rPr>
+      </w:pPr>
+    </w:p>
+    <w:p>
+      <w:r>
+        <w:rPr>
+          <w:b/>
+          <w:bCs/>
+        </w:rPr>
+        <w:t>GameMode</w:t>
+      </w:r>
+      <w:r>
+        <w:t xml:space="preserve"> </w:t>
+      </w:r>
+      <w:r>
+        <w:t xml:space="preserve">– Every level has it’s own GameMode.  You can override the GameMode on a per level basis.  </w:t>
+      </w:r>
+    </w:p>
+    <w:p/>
+    <w:p>
+      <w:r>
+        <w:rPr>
+          <w:b/>
+          <w:bCs/>
+        </w:rPr>
+        <w:t>Game Mode</w:t>
+      </w:r>
+      <w:r>
+        <w:t xml:space="preserve"> drives general universal  game's logic and functionality, and the game state is where that data is stored and passed on to all clients.  </w:t>
+      </w:r>
+    </w:p>
+    <w:p>
+      <w:pPr>
+        <w:rPr>
+          <w:b/>
+          <w:bCs/>
+        </w:rPr>
+      </w:pPr>
+    </w:p>
+    <w:p>
+      <w:r>
+        <w:rPr>
+          <w:b/>
+          <w:bCs/>
+        </w:rPr>
+        <w:t>Game Session</w:t>
+      </w:r>
+      <w:r>
+        <w:t xml:space="preserve"> - Handles logins and acts as an interface to the online service like Steam.  Server-Side</w:t>
+      </w:r>
+      <w:r>
+        <w:t>.</w:t>
+      </w:r>
+    </w:p>
+    <w:p/>
+    <w:p>
+      <w:r>
+        <w:rPr>
+          <w:b/>
+          <w:bCs/>
+          <w:i/>
+          <w:iCs/>
+        </w:rPr>
+        <w:t>Game Session</w:t>
+      </w:r>
+      <w:r>
+        <w:t xml:space="preserve"> represents the creation of a server and the matchmaking process.  Handles joining and leaving</w:t>
+      </w:r>
+    </w:p>
+    <w:p/>
+    <w:p>
+      <w:r>
+        <w:rPr>
+          <w:b/>
+          <w:bCs/>
+          <w:i/>
+          <w:iCs/>
+        </w:rPr>
+        <w:t>Game Session</w:t>
+      </w:r>
+      <w:r>
+        <w:t xml:space="preserve"> </w:t>
+      </w:r>
+      <w:r>
+        <w:t xml:space="preserve">is not needed for single player games unless you want to use it like a gameState class, but then you don’t need the gamestate class.  </w:t>
+      </w:r>
+    </w:p>
+    <w:p/>
+    <w:p>
+      <w:r>
+        <w:rPr>
+          <w:b/>
+          <w:bCs/>
+        </w:rPr>
+        <w:t>GameState</w:t>
+      </w:r>
+      <w:r>
+        <w:t xml:space="preserve"> - Server Authority but is passed on to all </w:t>
+      </w:r>
+      <w:r>
+        <w:rPr>
+          <w:i/>
+          <w:iCs/>
+        </w:rPr>
+        <w:t>clients</w:t>
+      </w:r>
+      <w:r>
+        <w:t>., data that all players should know about the game.  Gamestate is like an object instance of the current GameMode</w:t>
+      </w:r>
+      <w:r>
+        <w:t xml:space="preserve"> (which acts like a blueprint template)</w:t>
+      </w:r>
+      <w:r>
+        <w:t xml:space="preserve">, in that </w:t>
+      </w:r>
+      <w:r>
+        <w:t>the GameState</w:t>
+      </w:r>
+      <w:r>
+        <w:t xml:space="preserve"> holds current game values based on the games rules set in the GameMode.  GameState doesn't inherit from GameMode but there is a direct correlation in what the GameState should hold for current game values.</w:t>
+      </w:r>
+    </w:p>
+    <w:p/>
+    <w:p/>
+    <w:p>
+      <w:r>
+        <w:rPr>
+          <w:b/>
+          <w:bCs/>
+        </w:rPr>
+        <w:t xml:space="preserve">GameState </w:t>
+      </w:r>
+      <w:r>
+        <w:t>is</w:t>
+      </w:r>
+      <w:r>
+        <w:t xml:space="preserve"> just the game's current variables</w:t>
+      </w:r>
+      <w:r>
+        <w:t xml:space="preserve">’ </w:t>
+      </w:r>
+      <w:r>
+        <w:t>values that needs to be replicated across all clients.</w:t>
+      </w:r>
+    </w:p>
+    <w:p/>
+    <w:p>
+      <w:r>
+        <w:rPr>
+          <w:b/>
+          <w:bCs/>
+        </w:rPr>
+        <w:t xml:space="preserve">GameState </w:t>
+      </w:r>
+      <w:r>
+        <w:t xml:space="preserve">- calls create </w:t>
+      </w:r>
+      <w:r>
+        <w:t>Game</w:t>
+      </w:r>
+      <w:r>
+        <w:t>NetworkManager</w:t>
+      </w:r>
+    </w:p>
+    <w:p/>
+    <w:p>
+      <w:r>
+        <w:rPr>
+          <w:b/>
+          <w:bCs/>
+        </w:rPr>
+        <w:t>Game Network Manager</w:t>
+      </w:r>
+      <w:r>
+        <w:t xml:space="preserve"> - cheat detection, movement prediction / interopolation.  Server-Side</w:t>
+      </w:r>
+    </w:p>
+    <w:p/>
+    <w:p>
+      <w:r>
+        <w:rPr>
+          <w:b/>
+          <w:bCs/>
+        </w:rPr>
+        <w:t>UWorld-&gt;LoadMap</w:t>
+      </w:r>
+      <w:r>
+        <w:t xml:space="preserve"> </w:t>
+      </w:r>
+      <w:r>
+        <w:t>–</w:t>
+      </w:r>
+      <w:r>
+        <w:t xml:space="preserve"> </w:t>
+      </w:r>
+      <w:r>
+        <w:t>This actually happens before AGameModeBase is creater.  Lastly, after GameState is created, LoadMap()</w:t>
+      </w:r>
+      <w:r>
+        <w:t xml:space="preserve"> creates </w:t>
+      </w:r>
+      <w:r>
+        <w:rPr>
+          <w:i/>
+          <w:iCs/>
+        </w:rPr>
+        <w:t>PlayerController</w:t>
+      </w:r>
+      <w:r>
+        <w:t>.</w:t>
+      </w:r>
+    </w:p>
+    <w:p/>
+    <w:p>
+      <w:r>
+        <w:rPr>
+          <w:b/>
+          <w:bCs/>
+        </w:rPr>
+        <w:t>PlayerController -</w:t>
+      </w:r>
+      <w:r>
+        <w:t xml:space="preserve">   Server Authority, replicates to self for client side.  Spawn a PlayerState actor.</w:t>
+      </w:r>
+      <w:r>
+        <w:t xml:space="preserve">  Relevant to owning player only.  </w:t>
+      </w:r>
+      <w:r>
+        <w:t xml:space="preserve"> </w:t>
+      </w:r>
+      <w:r>
+        <w:t>PlayerController drives player specific functionality, like movement controls, camera controls,  controlling pawn</w:t>
+      </w:r>
+    </w:p>
+    <w:p/>
+    <w:p/>
+    <w:p>
+      <w:r>
+        <w:rPr>
+          <w:b/>
+          <w:bCs/>
+        </w:rPr>
+        <w:t>PlayerState -</w:t>
+      </w:r>
+      <w:r>
+        <w:t xml:space="preserve"> Client-Side, associates current game's data which is relevant to that player controller only.  Some of the Game's current data does not need to all be in the GameState's class.  The PlayerState offloads some of that managed data directly on the playerController in the form of PlayerState.</w:t>
+      </w:r>
+      <w:r>
+        <w:t xml:space="preserve">  Player’s current standing in the game relevant to other players.  </w:t>
+      </w:r>
+    </w:p>
+    <w:p/>
+    <w:p>
+      <w:r>
+        <w:rPr>
+          <w:b/>
+          <w:bCs/>
+        </w:rPr>
+        <w:t>Pawn</w:t>
+      </w:r>
+      <w:r>
+        <w:t xml:space="preserve"> – In world representation of the actor based on the PlayerController input logic.  This spawns in GameMode’s PostLogin() function after the PlayerState finishes loading.  PlayerController attempts to possess the pawn once Pawn is loaded.  </w:t>
+      </w:r>
+      <w:r>
+        <w:t xml:space="preserve"> How a character looks.  </w:t>
+      </w:r>
+    </w:p>
+    <w:p/>
+    <w:p>
+      <w:r>
+        <w:rPr>
+          <w:b/>
+          <w:bCs/>
+        </w:rPr>
+        <w:t>UWorld::BeginPlay()</w:t>
+      </w:r>
+      <w:r>
+        <w:t xml:space="preserve"> – For the map and all actors in that map gets their BeginPlay() called which in turn starts their Tick() function as well.</w:t>
+      </w:r>
+    </w:p>
+    <w:p/>
+    <w:p>
+      <w:r>
+        <w:rPr>
+          <w:b/>
+          <w:bCs/>
+        </w:rPr>
+        <w:t>USaveGameObject</w:t>
+      </w:r>
+      <w:r>
+        <w:t>s used for saving games after game is shutdown.</w:t>
+      </w:r>
+    </w:p>
+    <w:p/>
+    <w:p/>
+    <w:p>
+      <w:r>
+        <w:rPr>
+          <w:b/>
+          <w:bCs/>
+          <w:i/>
+          <w:iCs/>
+        </w:rPr>
+        <w:t>Bind a callback function</w:t>
+      </w:r>
+      <w:r>
+        <w:t xml:space="preserve"> </w:t>
+      </w:r>
+      <w:r>
+        <w:t xml:space="preserve">to a delegate </w:t>
+      </w:r>
+      <w:r>
+        <w:t>that exists in the engine</w:t>
+      </w:r>
+      <w:r>
+        <w:t xml:space="preserve"> code</w:t>
+      </w:r>
+      <w:r>
+        <w:t xml:space="preserve"> (versus using inheritance to override aGameModeBase class </w:t>
+      </w:r>
+      <w:r>
+        <w:t>by</w:t>
+      </w:r>
+      <w:r>
+        <w:t xml:space="preserve"> creat</w:t>
+      </w:r>
+      <w:r>
+        <w:t>ing</w:t>
+      </w:r>
+      <w:r>
+        <w:t xml:space="preserve"> your own GameMode class).  Just insert code directly into aGameModeBase class in the engine, in the form of a callback function.  The delegate exists as it’s own thing in one of your game’s classes</w:t>
+      </w:r>
+      <w:r>
+        <w:t xml:space="preserve"> and gets triggered once the engine’s GameModeBase class does something.   The engine defines some static delegates that already exist: Core Delegates, Core-UObject delegates, GameViewPort delegates, Game delegates, and World delegates.</w:t>
+      </w:r>
+    </w:p>
+    <w:p/>
+    <w:p>
+      <w:r>
+        <w:t>Subsystem feature:</w:t>
       </w:r>
     </w:p>
     <w:p>
@@ -2610,10 +3195,9 @@
           <w:ilvl w:val="0"/>
           <w:numId w:val="1"/>
         </w:numPr>
-        <w:spacing w:after="160" w:line="259" w:lineRule="auto"/>
-      </w:pPr>
-      <w:r>
-        <w:t>Dafont.com, download font, unzip.</w:t>
+      </w:pPr>
+      <w:r>
+        <w:t>Add modular functionality easier</w:t>
       </w:r>
     </w:p>
     <w:p>
@@ -2623,10 +3207,9 @@
           <w:ilvl w:val="0"/>
           <w:numId w:val="1"/>
         </w:numPr>
-        <w:spacing w:after="160" w:line="259" w:lineRule="auto"/>
-      </w:pPr>
-      <w:r>
-        <w:t>Import ttf into a folder in unreal by selecting the import button top of content browser</w:t>
+      </w:pPr>
+      <w:r>
+        <w:t>Define a class that extends one of the subsystem types</w:t>
       </w:r>
     </w:p>
     <w:p>
@@ -2636,28 +3219,43 @@
           <w:ilvl w:val="0"/>
           <w:numId w:val="1"/>
         </w:numPr>
-        <w:spacing w:after="160" w:line="259" w:lineRule="auto"/>
-      </w:pPr>
-      <w:r>
-        <w:t>Change the font to the imported font in the Widget Blueprint, under text in details panel.</w:t>
-      </w:r>
-    </w:p>
-    <w:p/>
-    <w:p>
-      <w:r>
-        <w:t>Expose a variable to set that on the instance.</w:t>
-      </w:r>
-    </w:p>
-    <w:p>
-      <w:r>
-        <w:t>[Random Unit Vector] * a float value like 100 to make a random transform.</w:t>
-      </w:r>
-    </w:p>
-    <w:p>
-      <w:r>
-        <w:t>Add Static Mesh Component in a for loop in constructor for randomly generated content</w:t>
-      </w:r>
-    </w:p>
+      </w:pPr>
+      <w:r>
+        <w:t>Engine automatically creates an instance of your subsystem class that is tied to the lifetime of the corresponding object.</w:t>
+      </w:r>
+    </w:p>
+    <w:p>
+      <w:pPr>
+        <w:pStyle w:val="ListParagraph"/>
+        <w:numPr>
+          <w:ilvl w:val="0"/>
+          <w:numId w:val="1"/>
+        </w:numPr>
+      </w:pPr>
+      <w:r>
+        <w:t xml:space="preserve">Example: A plugin might offer a custom game instance class (defined in that plugin), but if you wanted to use another plugin that defined a different game instance class, </w:t>
+      </w:r>
+      <w:r>
+        <w:t xml:space="preserve">you’d be out of luck (for just plug and playing the second plugin).  </w:t>
+      </w:r>
+    </w:p>
+    <w:p>
+      <w:pPr>
+        <w:pStyle w:val="ListParagraph"/>
+        <w:numPr>
+          <w:ilvl w:val="1"/>
+          <w:numId w:val="1"/>
+        </w:numPr>
+      </w:pPr>
+      <w:r>
+        <w:t xml:space="preserve">By creating a custom subsystem based on the UGameInstanceSubsystem type, you’d be able to use both custom plugins.  </w:t>
+      </w:r>
+    </w:p>
+    <w:p/>
+    <w:p/>
+    <w:p/>
+    <w:p/>
+    <w:p/>
     <w:p/>
     <w:sectPr>
       <w:pgSz w:w="12240" w:h="15840"/>
@@ -3731,6 +4329,7 @@
   <w:style w:type="character" w:default="1" w:styleId="DefaultParagraphFont">
     <w:name w:val="Default Paragraph Font"/>
     <w:uiPriority w:val="1"/>
+    <w:semiHidden/>
     <w:unhideWhenUsed/>
   </w:style>
   <w:style w:type="table" w:default="1" w:styleId="TableNormal">

</xml_diff>

<commit_message>
updates to freeCodeCamp project
</commit_message>
<xml_diff>
--- a/Notes/_Unreal Notes/Unreal Notes.docx
+++ b/Notes/_Unreal Notes/Unreal Notes.docx
@@ -5,51 +5,184 @@
     <w:p>
       <w:pPr>
         <w:rPr>
+          <w:rFonts w:ascii="Alasassy Caps" w:hAnsi="Alasassy Caps"/>
+          <w:b/>
+          <w:bCs/>
+          <w:sz w:val="40"/>
+          <w:szCs w:val="40"/>
+          <w:u w:val="single"/>
+        </w:rPr>
+      </w:pPr>
+      <w:r>
+        <w:rPr>
+          <w:rFonts w:ascii="Alasassy Caps" w:hAnsi="Alasassy Caps"/>
+          <w:b/>
+          <w:bCs/>
+          <w:sz w:val="40"/>
+          <w:szCs w:val="40"/>
+          <w:u w:val="single"/>
+        </w:rPr>
+        <w:t>Unreal Notes</w:t>
+      </w:r>
+    </w:p>
+    <w:p>
+      <w:pPr>
+        <w:rPr>
           <w:b/>
           <w:bCs/>
           <w:u w:val="single"/>
         </w:rPr>
       </w:pPr>
-      <w:r>
+    </w:p>
+    <w:p>
+      <w:pPr>
         <w:rPr>
           <w:b/>
           <w:bCs/>
           <w:u w:val="single"/>
         </w:rPr>
-        <w:t>Creating Plugins:</w:t>
-      </w:r>
-    </w:p>
-    <w:p>
-      <w:pPr>
+      </w:pPr>
+      <w:r>
         <w:rPr>
           <w:b/>
           <w:bCs/>
           <w:u w:val="single"/>
         </w:rPr>
-      </w:pPr>
-      <w:r>
+        <w:t>Player controller index Explained</w:t>
+      </w:r>
+    </w:p>
+    <w:p/>
+    <w:p>
+      <w:pPr>
+        <w:pStyle w:val="ListParagraph"/>
+        <w:numPr>
+          <w:ilvl w:val="0"/>
+          <w:numId w:val="5"/>
+        </w:numPr>
+      </w:pPr>
+      <w:r>
+        <w:t>Think of the PlayerController Index like the controller ports on a console: Player1, Player2, etc</w:t>
+      </w:r>
+    </w:p>
+    <w:p>
+      <w:pPr>
+        <w:pStyle w:val="ListParagraph"/>
+        <w:numPr>
+          <w:ilvl w:val="0"/>
+          <w:numId w:val="5"/>
+        </w:numPr>
+      </w:pPr>
+      <w:r>
+        <w:t>They are primarily used for local-multiplayer.</w:t>
+      </w:r>
+    </w:p>
+    <w:p>
+      <w:pPr>
+        <w:pStyle w:val="ListParagraph"/>
+        <w:numPr>
+          <w:ilvl w:val="0"/>
+          <w:numId w:val="5"/>
+        </w:numPr>
+      </w:pPr>
+      <w:r>
+        <w:t>There is a different online ID for identifying unique players and player sessions.</w:t>
+      </w:r>
+    </w:p>
+    <w:p>
+      <w:pPr>
+        <w:pStyle w:val="ListParagraph"/>
+        <w:numPr>
+          <w:ilvl w:val="0"/>
+          <w:numId w:val="5"/>
+        </w:numPr>
+      </w:pPr>
+      <w:r>
+        <w:t>Player Controller is a local index, accessing PlayerController on the server will fail if the server is a dedicated server.</w:t>
+      </w:r>
+    </w:p>
+    <w:p/>
+    <w:p>
+      <w:pPr>
         <w:rPr>
           <w:b/>
           <w:bCs/>
           <w:u w:val="single"/>
         </w:rPr>
-        <w:t>Unreal Engine 5 – Full Course for Beginners (FreeCodeCamp)</w:t>
-      </w:r>
-    </w:p>
-    <w:p>
-      <w:pPr>
+      </w:pPr>
+      <w:r>
         <w:rPr>
           <w:b/>
           <w:bCs/>
           <w:u w:val="single"/>
         </w:rPr>
-      </w:pPr>
-    </w:p>
-    <w:p>
-      <w:r>
-        <w:t>Plugin as a wrapper (convert std::string to FString for example), and you would interface that functionality through the plug-in as an interface interacting with Unreal Engine.</w:t>
-      </w:r>
-    </w:p>
+        <w:t>Multiplayer Options – Net Mode</w:t>
+      </w:r>
+    </w:p>
+    <w:p>
+      <w:pPr>
+        <w:pStyle w:val="ListParagraph"/>
+        <w:numPr>
+          <w:ilvl w:val="0"/>
+          <w:numId w:val="6"/>
+        </w:numPr>
+      </w:pPr>
+      <w:r>
+        <w:rPr>
+          <w:i/>
+          <w:iCs/>
+        </w:rPr>
+        <w:t>standalone</w:t>
+      </w:r>
+      <w:r>
+        <w:t xml:space="preserve"> - 2 separate instances of the game</w:t>
+      </w:r>
+    </w:p>
+    <w:p>
+      <w:pPr>
+        <w:pStyle w:val="ListParagraph"/>
+        <w:numPr>
+          <w:ilvl w:val="0"/>
+          <w:numId w:val="6"/>
+        </w:numPr>
+      </w:pPr>
+      <w:r>
+        <w:rPr>
+          <w:i/>
+          <w:iCs/>
+        </w:rPr>
+        <w:t xml:space="preserve">play as </w:t>
+      </w:r>
+      <w:r>
+        <w:rPr>
+          <w:i/>
+          <w:iCs/>
+        </w:rPr>
+        <w:t>listen server</w:t>
+      </w:r>
+      <w:r>
+        <w:t xml:space="preserve"> - dedicated server</w:t>
+      </w:r>
+    </w:p>
+    <w:p>
+      <w:pPr>
+        <w:pStyle w:val="ListParagraph"/>
+        <w:numPr>
+          <w:ilvl w:val="0"/>
+          <w:numId w:val="6"/>
+        </w:numPr>
+      </w:pPr>
+      <w:r>
+        <w:rPr>
+          <w:i/>
+          <w:iCs/>
+        </w:rPr>
+        <w:t>play as client -</w:t>
+      </w:r>
+      <w:r>
+        <w:t xml:space="preserve"> a client hosts a server and is also a player, and other clients join as clients only</w:t>
+      </w:r>
+    </w:p>
+    <w:p/>
     <w:p>
       <w:pPr>
         <w:rPr>
@@ -58,17 +191,40 @@
           <w:u w:val="single"/>
         </w:rPr>
       </w:pPr>
-    </w:p>
-    <w:p>
-      <w:pPr>
-        <w:rPr>
+      <w:r>
+        <w:rPr>
+          <w:b/>
+          <w:bCs/>
           <w:u w:val="single"/>
         </w:rPr>
-      </w:pPr>
-      <w:r>
-        <w:rPr>
+        <w:t>Creating Plugins:</w:t>
+      </w:r>
+    </w:p>
+    <w:p/>
+    <w:p>
+      <w:r>
+        <w:t>Plugin as a wrapper (convert std::string to FString for example), and you would interface that functionality through the plug-in as an interface interacting with Unreal Engine.</w:t>
+      </w:r>
+    </w:p>
+    <w:p>
+      <w:pPr>
+        <w:rPr>
+          <w:b/>
+          <w:bCs/>
           <w:u w:val="single"/>
         </w:rPr>
+      </w:pPr>
+    </w:p>
+    <w:p>
+      <w:pPr>
+        <w:rPr>
+          <w:u w:val="single"/>
+        </w:rPr>
+      </w:pPr>
+      <w:r>
+        <w:rPr>
+          <w:u w:val="single"/>
+        </w:rPr>
         <w:t xml:space="preserve">Simple </w:t>
       </w:r>
       <w:r>
@@ -186,6 +342,7 @@
     </w:p>
     <w:p>
       <w:r>
+        <w:lastRenderedPageBreak/>
         <w:t>- Open up the Unreal Editor for that second project.</w:t>
       </w:r>
     </w:p>
@@ -342,7 +499,6 @@
         </w:numPr>
       </w:pPr>
       <w:r>
-        <w:lastRenderedPageBreak/>
         <w:t>Place solution in same library checkbox</w:t>
       </w:r>
     </w:p>
@@ -722,7 +878,6 @@
     </w:p>
     <w:p>
       <w:r>
-        <w:lastRenderedPageBreak/>
         <w:t>Clock Symbol in BP is an ASync task</w:t>
       </w:r>
     </w:p>
@@ -847,6 +1002,7 @@
     </w:p>
     <w:p>
       <w:r>
+        <w:lastRenderedPageBreak/>
         <w:t>LineTraceEnd = LTStart + (LTDirection * Reach);</w:t>
       </w:r>
     </w:p>
@@ -914,7 +1070,6 @@
     </w:p>
     <w:p>
       <w:r>
-        <w:lastRenderedPageBreak/>
         <w:t>FCollisionObjectQueryParam(ECollisionChannel::ECC_PhysicsBody), QueryParams)</w:t>
       </w:r>
     </w:p>
@@ -1029,6 +1184,7 @@
           <w:bCs/>
           <w:u w:val="single"/>
         </w:rPr>
+        <w:lastRenderedPageBreak/>
         <w:t>Blueprint Communication</w:t>
       </w:r>
     </w:p>
@@ -1138,7 +1294,6 @@
         </w:rPr>
       </w:pPr>
       <w:r>
-        <w:lastRenderedPageBreak/>
         <w:t>Custom event, function calls, timelines, and add component nodes cannot be used</w:t>
       </w:r>
     </w:p>
@@ -1314,6 +1469,7 @@
         <w:rPr>
           <w:i/>
         </w:rPr>
+        <w:lastRenderedPageBreak/>
         <w:t>How to create a BP Interface</w:t>
       </w:r>
       <w:r>
@@ -1425,7 +1581,6 @@
         </w:numPr>
       </w:pPr>
       <w:r>
-        <w:lastRenderedPageBreak/>
         <w:t>Once the receiving BP receives that reference (via a cast, or whatever), it assigns or binds a custom event, which then performs some logic.</w:t>
       </w:r>
     </w:p>
@@ -1497,10 +1652,10 @@
             <v:path o:extrusionok="f" gradientshapeok="t" o:connecttype="rect"/>
             <o:lock v:ext="edit" aspectratio="t"/>
           </v:shapetype>
-          <v:shape id="_x0000_i1025" type="#_x0000_t75" style="width:469.3pt;height:201pt" o:ole="">
+          <v:shape id="_x0000_i1025" type="#_x0000_t75" style="width:469.35pt;height:200.8pt" o:ole="">
             <v:imagedata r:id="rId5" o:title=""/>
           </v:shape>
-          <o:OLEObject Type="Embed" ProgID="Photoshop.Image.16" ShapeID="_x0000_i1025" DrawAspect="Content" ObjectID="_1804245403" r:id="rId6">
+          <o:OLEObject Type="Embed" ProgID="Photoshop.Image.16" ShapeID="_x0000_i1025" DrawAspect="Content" ObjectID="_1804577545" r:id="rId6">
             <o:FieldCodes>\s</o:FieldCodes>
           </o:OLEObject>
         </w:object>
@@ -1573,7 +1728,6 @@
         </w:numPr>
       </w:pPr>
       <w:r>
-        <w:lastRenderedPageBreak/>
         <w:t>When you want to communicate to multiple objects with same class - get all actors of class, cast to and call function in loop (but interfaces are more elegant and flexible here)</w:t>
       </w:r>
     </w:p>
@@ -2321,6 +2475,7 @@
           <w:bCs/>
           <w:u w:val="single"/>
         </w:rPr>
+        <w:lastRenderedPageBreak/>
         <w:t>Unreal Tips:</w:t>
       </w:r>
     </w:p>
@@ -2467,162 +2622,162 @@
         <w:spacing w:after="160" w:line="259" w:lineRule="auto"/>
       </w:pPr>
       <w:r>
+        <w:t>Instead of vector parameter for a flat color, add two texture sample nodes</w:t>
+      </w:r>
+    </w:p>
+    <w:p>
+      <w:pPr>
+        <w:pStyle w:val="ListParagraph"/>
+        <w:numPr>
+          <w:ilvl w:val="0"/>
+          <w:numId w:val="1"/>
+        </w:numPr>
+        <w:spacing w:after="160" w:line="259" w:lineRule="auto"/>
+      </w:pPr>
+      <w:r>
+        <w:t>Add Landscape Layer Coords and feed them into those two texture sample nodes</w:t>
+      </w:r>
+    </w:p>
+    <w:p>
+      <w:r>
+        <w:t>Export your own heightmap</w:t>
+      </w:r>
+    </w:p>
+    <w:p>
+      <w:pPr>
+        <w:pStyle w:val="ListParagraph"/>
+        <w:numPr>
+          <w:ilvl w:val="0"/>
+          <w:numId w:val="1"/>
+        </w:numPr>
+        <w:spacing w:after="160" w:line="259" w:lineRule="auto"/>
+      </w:pPr>
+      <w:r>
+        <w:t>Landscape -&gt; Scope -&gt; Right click on height map under targeted layer, export to file</w:t>
+      </w:r>
+    </w:p>
+    <w:p>
+      <w:r>
+        <w:t>Import height map for creating a new landscape</w:t>
+      </w:r>
+    </w:p>
+    <w:p>
+      <w:pPr>
+        <w:pStyle w:val="ListParagraph"/>
+        <w:numPr>
+          <w:ilvl w:val="0"/>
+          <w:numId w:val="1"/>
+        </w:numPr>
+        <w:spacing w:after="160" w:line="259" w:lineRule="auto"/>
+      </w:pPr>
+      <w:r>
+        <w:t>Landscape (with no landscape already in there) - &gt; Manage -&gt; Import from file</w:t>
+      </w:r>
+    </w:p>
+    <w:p>
+      <w:r>
+        <w:t>Change Map from high to low</w:t>
+      </w:r>
+    </w:p>
+    <w:p>
+      <w:pPr>
+        <w:pStyle w:val="ListParagraph"/>
+        <w:numPr>
+          <w:ilvl w:val="0"/>
+          <w:numId w:val="1"/>
+        </w:numPr>
+        <w:spacing w:after="160" w:line="259" w:lineRule="auto"/>
+      </w:pPr>
+      <w:r>
+        <w:t>Landscape -&gt; Manage -&gt; SelectionTool -&gt; ChangeComponentSize, lower quad size, and resample</w:t>
+      </w:r>
+    </w:p>
+    <w:p>
+      <w:r>
+        <w:t>For resizing images automatically in a Blueprint Widget</w:t>
+      </w:r>
+    </w:p>
+    <w:p>
+      <w:pPr>
+        <w:pStyle w:val="ListParagraph"/>
+        <w:numPr>
+          <w:ilvl w:val="0"/>
+          <w:numId w:val="1"/>
+        </w:numPr>
+        <w:spacing w:after="160" w:line="259" w:lineRule="auto"/>
+      </w:pPr>
+      <w:r>
+        <w:t>Add a scale box to the canvas panel</w:t>
+      </w:r>
+    </w:p>
+    <w:p>
+      <w:pPr>
+        <w:pStyle w:val="ListParagraph"/>
+        <w:numPr>
+          <w:ilvl w:val="0"/>
+          <w:numId w:val="1"/>
+        </w:numPr>
+        <w:spacing w:after="160" w:line="259" w:lineRule="auto"/>
+      </w:pPr>
+      <w:r>
+        <w:t>Make the image panel a child of the scale box</w:t>
+      </w:r>
+    </w:p>
+    <w:p>
+      <w:pPr>
+        <w:pStyle w:val="ListParagraph"/>
+        <w:numPr>
+          <w:ilvl w:val="0"/>
+          <w:numId w:val="1"/>
+        </w:numPr>
+        <w:spacing w:after="160" w:line="259" w:lineRule="auto"/>
+      </w:pPr>
+      <w:r>
+        <w:t>Set Scale Box Anchor to Fill Entire Canvas, and set all offsets to 0, 0, 0, 0.</w:t>
+      </w:r>
+    </w:p>
+    <w:p>
+      <w:pPr>
+        <w:pStyle w:val="ListParagraph"/>
+        <w:numPr>
+          <w:ilvl w:val="0"/>
+          <w:numId w:val="1"/>
+        </w:numPr>
+        <w:spacing w:after="160" w:line="259" w:lineRule="auto"/>
+      </w:pPr>
+      <w:r>
+        <w:t>Then under Stretching of the details panel, use dropdown of stretch, and set it to Scale to Fill.</w:t>
+      </w:r>
+    </w:p>
+    <w:p>
+      <w:r>
+        <w:t>Adding Custom Fonts (be sure to read the copy write license):</w:t>
+      </w:r>
+    </w:p>
+    <w:p>
+      <w:pPr>
+        <w:pStyle w:val="ListParagraph"/>
+        <w:numPr>
+          <w:ilvl w:val="0"/>
+          <w:numId w:val="1"/>
+        </w:numPr>
+        <w:spacing w:after="160" w:line="259" w:lineRule="auto"/>
+      </w:pPr>
+      <w:r>
+        <w:t>Dafont.com, download font, unzip.</w:t>
+      </w:r>
+    </w:p>
+    <w:p>
+      <w:pPr>
+        <w:pStyle w:val="ListParagraph"/>
+        <w:numPr>
+          <w:ilvl w:val="0"/>
+          <w:numId w:val="1"/>
+        </w:numPr>
+        <w:spacing w:after="160" w:line="259" w:lineRule="auto"/>
+      </w:pPr>
+      <w:r>
         <w:lastRenderedPageBreak/>
-        <w:t>Instead of vector parameter for a flat color, add two texture sample nodes</w:t>
-      </w:r>
-    </w:p>
-    <w:p>
-      <w:pPr>
-        <w:pStyle w:val="ListParagraph"/>
-        <w:numPr>
-          <w:ilvl w:val="0"/>
-          <w:numId w:val="1"/>
-        </w:numPr>
-        <w:spacing w:after="160" w:line="259" w:lineRule="auto"/>
-      </w:pPr>
-      <w:r>
-        <w:t>Add Landscape Layer Coords and feed them into those two texture sample nodes</w:t>
-      </w:r>
-    </w:p>
-    <w:p>
-      <w:r>
-        <w:t>Export your own heightmap</w:t>
-      </w:r>
-    </w:p>
-    <w:p>
-      <w:pPr>
-        <w:pStyle w:val="ListParagraph"/>
-        <w:numPr>
-          <w:ilvl w:val="0"/>
-          <w:numId w:val="1"/>
-        </w:numPr>
-        <w:spacing w:after="160" w:line="259" w:lineRule="auto"/>
-      </w:pPr>
-      <w:r>
-        <w:t>Landscape -&gt; Scope -&gt; Right click on height map under targeted layer, export to file</w:t>
-      </w:r>
-    </w:p>
-    <w:p>
-      <w:r>
-        <w:t>Import height map for creating a new landscape</w:t>
-      </w:r>
-    </w:p>
-    <w:p>
-      <w:pPr>
-        <w:pStyle w:val="ListParagraph"/>
-        <w:numPr>
-          <w:ilvl w:val="0"/>
-          <w:numId w:val="1"/>
-        </w:numPr>
-        <w:spacing w:after="160" w:line="259" w:lineRule="auto"/>
-      </w:pPr>
-      <w:r>
-        <w:t>Landscape (with no landscape already in there) - &gt; Manage -&gt; Import from file</w:t>
-      </w:r>
-    </w:p>
-    <w:p>
-      <w:r>
-        <w:t>Change Map from high to low</w:t>
-      </w:r>
-    </w:p>
-    <w:p>
-      <w:pPr>
-        <w:pStyle w:val="ListParagraph"/>
-        <w:numPr>
-          <w:ilvl w:val="0"/>
-          <w:numId w:val="1"/>
-        </w:numPr>
-        <w:spacing w:after="160" w:line="259" w:lineRule="auto"/>
-      </w:pPr>
-      <w:r>
-        <w:t>Landscape -&gt; Manage -&gt; SelectionTool -&gt; ChangeComponentSize, lower quad size, and resample</w:t>
-      </w:r>
-    </w:p>
-    <w:p>
-      <w:r>
-        <w:t>For resizing images automatically in a Blueprint Widget</w:t>
-      </w:r>
-    </w:p>
-    <w:p>
-      <w:pPr>
-        <w:pStyle w:val="ListParagraph"/>
-        <w:numPr>
-          <w:ilvl w:val="0"/>
-          <w:numId w:val="1"/>
-        </w:numPr>
-        <w:spacing w:after="160" w:line="259" w:lineRule="auto"/>
-      </w:pPr>
-      <w:r>
-        <w:t>Add a scale box to the canvas panel</w:t>
-      </w:r>
-    </w:p>
-    <w:p>
-      <w:pPr>
-        <w:pStyle w:val="ListParagraph"/>
-        <w:numPr>
-          <w:ilvl w:val="0"/>
-          <w:numId w:val="1"/>
-        </w:numPr>
-        <w:spacing w:after="160" w:line="259" w:lineRule="auto"/>
-      </w:pPr>
-      <w:r>
-        <w:t>Make the image panel a child of the scale box</w:t>
-      </w:r>
-    </w:p>
-    <w:p>
-      <w:pPr>
-        <w:pStyle w:val="ListParagraph"/>
-        <w:numPr>
-          <w:ilvl w:val="0"/>
-          <w:numId w:val="1"/>
-        </w:numPr>
-        <w:spacing w:after="160" w:line="259" w:lineRule="auto"/>
-      </w:pPr>
-      <w:r>
-        <w:t>Set Scale Box Anchor to Fill Entire Canvas, and set all offsets to 0, 0, 0, 0.</w:t>
-      </w:r>
-    </w:p>
-    <w:p>
-      <w:pPr>
-        <w:pStyle w:val="ListParagraph"/>
-        <w:numPr>
-          <w:ilvl w:val="0"/>
-          <w:numId w:val="1"/>
-        </w:numPr>
-        <w:spacing w:after="160" w:line="259" w:lineRule="auto"/>
-      </w:pPr>
-      <w:r>
-        <w:t>Then under Stretching of the details panel, use dropdown of stretch, and set it to Scale to Fill.</w:t>
-      </w:r>
-    </w:p>
-    <w:p>
-      <w:r>
-        <w:t>Adding Custom Fonts (be sure to read the copy write license):</w:t>
-      </w:r>
-    </w:p>
-    <w:p>
-      <w:pPr>
-        <w:pStyle w:val="ListParagraph"/>
-        <w:numPr>
-          <w:ilvl w:val="0"/>
-          <w:numId w:val="1"/>
-        </w:numPr>
-        <w:spacing w:after="160" w:line="259" w:lineRule="auto"/>
-      </w:pPr>
-      <w:r>
-        <w:t>Dafont.com, download font, unzip.</w:t>
-      </w:r>
-    </w:p>
-    <w:p>
-      <w:pPr>
-        <w:pStyle w:val="ListParagraph"/>
-        <w:numPr>
-          <w:ilvl w:val="0"/>
-          <w:numId w:val="1"/>
-        </w:numPr>
-        <w:spacing w:after="160" w:line="259" w:lineRule="auto"/>
-      </w:pPr>
-      <w:r>
         <w:t>Import ttf into a folder in unreal by selecting the import button top of content browser</w:t>
       </w:r>
     </w:p>
@@ -2719,16 +2874,7 @@
         <w:t>.  If you don’t need to do any functionality or collect data before a game map is loaded, you likely don’t need a custom game instance class.</w:t>
       </w:r>
       <w:r>
-        <w:t xml:space="preserve">  </w:t>
-      </w:r>
-      <w:r>
-        <w:t xml:space="preserve">GameInstance stores </w:t>
-      </w:r>
-      <w:r>
-        <w:t xml:space="preserve"> </w:t>
-      </w:r>
-      <w:r>
-        <w:t>data between levels.</w:t>
+        <w:t xml:space="preserve">  GameInstance stores  data between levels.</w:t>
       </w:r>
     </w:p>
     <w:p>
@@ -2737,7 +2883,6 @@
           <w:b/>
           <w:bCs/>
         </w:rPr>
-        <w:lastRenderedPageBreak/>
         <w:t xml:space="preserve">Game </w:t>
       </w:r>
       <w:r>
@@ -2748,10 +2893,7 @@
         <w:t>Instance</w:t>
       </w:r>
       <w:r>
-        <w:t xml:space="preserve"> </w:t>
-      </w:r>
-      <w:r>
-        <w:t xml:space="preserve"> - </w:t>
+        <w:t xml:space="preserve">  - </w:t>
       </w:r>
       <w:r>
         <w:t>Each player has their own unique Game Instance – client side.  No use using RPCs</w:t>
@@ -2858,10 +3000,7 @@
         <w:t>GameMode</w:t>
       </w:r>
       <w:r>
-        <w:t xml:space="preserve"> </w:t>
-      </w:r>
-      <w:r>
-        <w:t xml:space="preserve">– Every level has it’s own GameMode.  You can override the GameMode on a per level basis.  </w:t>
+        <w:t xml:space="preserve"> – Every level has it’s own GameMode.  You can override the GameMode on a per level basis.  </w:t>
       </w:r>
     </w:p>
     <w:p/>
@@ -2891,6 +3030,7 @@
           <w:b/>
           <w:bCs/>
         </w:rPr>
+        <w:lastRenderedPageBreak/>
         <w:t>Game Session</w:t>
       </w:r>
       <w:r>
@@ -3074,10 +3214,7 @@
         <w:t xml:space="preserve">  Relevant to owning player only.  </w:t>
       </w:r>
       <w:r>
-        <w:t xml:space="preserve"> </w:t>
-      </w:r>
-      <w:r>
-        <w:t>PlayerController drives player specific functionality, like movement controls, camera controls,  controlling pawn</w:t>
+        <w:t xml:space="preserve"> PlayerController drives player specific functionality, like movement controls, camera controls,  controlling pawn</w:t>
       </w:r>
     </w:p>
     <w:p/>
@@ -3120,6 +3257,7 @@
           <w:b/>
           <w:bCs/>
         </w:rPr>
+        <w:lastRenderedPageBreak/>
         <w:t>UWorld::BeginPlay()</w:t>
       </w:r>
       <w:r>
@@ -3382,6 +3520,119 @@
     </w:lvl>
   </w:abstractNum>
   <w:abstractNum w:abstractNumId="1" w15:restartNumberingAfterBreak="0">
+    <w:nsid w:val="11F93E45"/>
+    <w:multiLevelType w:val="hybridMultilevel"/>
+    <w:tmpl w:val="28E41A26"/>
+    <w:lvl w:ilvl="0" w:tplc="04090001">
+      <w:start w:val="1"/>
+      <w:numFmt w:val="bullet"/>
+      <w:lvlText w:val=""/>
+      <w:lvlJc w:val="left"/>
+      <w:pPr>
+        <w:ind w:left="360" w:hanging="360"/>
+      </w:pPr>
+      <w:rPr>
+        <w:rFonts w:ascii="Symbol" w:hAnsi="Symbol" w:hint="default"/>
+      </w:rPr>
+    </w:lvl>
+    <w:lvl w:ilvl="1" w:tplc="04090003" w:tentative="1">
+      <w:start w:val="1"/>
+      <w:numFmt w:val="bullet"/>
+      <w:lvlText w:val="o"/>
+      <w:lvlJc w:val="left"/>
+      <w:pPr>
+        <w:ind w:left="1080" w:hanging="360"/>
+      </w:pPr>
+      <w:rPr>
+        <w:rFonts w:ascii="Courier New" w:hAnsi="Courier New" w:cs="Courier New" w:hint="default"/>
+      </w:rPr>
+    </w:lvl>
+    <w:lvl w:ilvl="2" w:tplc="04090005" w:tentative="1">
+      <w:start w:val="1"/>
+      <w:numFmt w:val="bullet"/>
+      <w:lvlText w:val=""/>
+      <w:lvlJc w:val="left"/>
+      <w:pPr>
+        <w:ind w:left="1800" w:hanging="360"/>
+      </w:pPr>
+      <w:rPr>
+        <w:rFonts w:ascii="Wingdings" w:hAnsi="Wingdings" w:hint="default"/>
+      </w:rPr>
+    </w:lvl>
+    <w:lvl w:ilvl="3" w:tplc="04090001" w:tentative="1">
+      <w:start w:val="1"/>
+      <w:numFmt w:val="bullet"/>
+      <w:lvlText w:val=""/>
+      <w:lvlJc w:val="left"/>
+      <w:pPr>
+        <w:ind w:left="2520" w:hanging="360"/>
+      </w:pPr>
+      <w:rPr>
+        <w:rFonts w:ascii="Symbol" w:hAnsi="Symbol" w:hint="default"/>
+      </w:rPr>
+    </w:lvl>
+    <w:lvl w:ilvl="4" w:tplc="04090003" w:tentative="1">
+      <w:start w:val="1"/>
+      <w:numFmt w:val="bullet"/>
+      <w:lvlText w:val="o"/>
+      <w:lvlJc w:val="left"/>
+      <w:pPr>
+        <w:ind w:left="3240" w:hanging="360"/>
+      </w:pPr>
+      <w:rPr>
+        <w:rFonts w:ascii="Courier New" w:hAnsi="Courier New" w:cs="Courier New" w:hint="default"/>
+      </w:rPr>
+    </w:lvl>
+    <w:lvl w:ilvl="5" w:tplc="04090005" w:tentative="1">
+      <w:start w:val="1"/>
+      <w:numFmt w:val="bullet"/>
+      <w:lvlText w:val=""/>
+      <w:lvlJc w:val="left"/>
+      <w:pPr>
+        <w:ind w:left="3960" w:hanging="360"/>
+      </w:pPr>
+      <w:rPr>
+        <w:rFonts w:ascii="Wingdings" w:hAnsi="Wingdings" w:hint="default"/>
+      </w:rPr>
+    </w:lvl>
+    <w:lvl w:ilvl="6" w:tplc="04090001" w:tentative="1">
+      <w:start w:val="1"/>
+      <w:numFmt w:val="bullet"/>
+      <w:lvlText w:val=""/>
+      <w:lvlJc w:val="left"/>
+      <w:pPr>
+        <w:ind w:left="4680" w:hanging="360"/>
+      </w:pPr>
+      <w:rPr>
+        <w:rFonts w:ascii="Symbol" w:hAnsi="Symbol" w:hint="default"/>
+      </w:rPr>
+    </w:lvl>
+    <w:lvl w:ilvl="7" w:tplc="04090003" w:tentative="1">
+      <w:start w:val="1"/>
+      <w:numFmt w:val="bullet"/>
+      <w:lvlText w:val="o"/>
+      <w:lvlJc w:val="left"/>
+      <w:pPr>
+        <w:ind w:left="5400" w:hanging="360"/>
+      </w:pPr>
+      <w:rPr>
+        <w:rFonts w:ascii="Courier New" w:hAnsi="Courier New" w:cs="Courier New" w:hint="default"/>
+      </w:rPr>
+    </w:lvl>
+    <w:lvl w:ilvl="8" w:tplc="04090005" w:tentative="1">
+      <w:start w:val="1"/>
+      <w:numFmt w:val="bullet"/>
+      <w:lvlText w:val=""/>
+      <w:lvlJc w:val="left"/>
+      <w:pPr>
+        <w:ind w:left="6120" w:hanging="360"/>
+      </w:pPr>
+      <w:rPr>
+        <w:rFonts w:ascii="Wingdings" w:hAnsi="Wingdings" w:hint="default"/>
+      </w:rPr>
+    </w:lvl>
+  </w:abstractNum>
+  <w:abstractNum w:abstractNumId="2" w15:restartNumberingAfterBreak="0">
     <w:nsid w:val="259622EA"/>
     <w:multiLevelType w:val="hybridMultilevel"/>
     <w:tmpl w:val="FD1823BE"/>
@@ -3493,7 +3744,120 @@
       </w:rPr>
     </w:lvl>
   </w:abstractNum>
-  <w:abstractNum w:abstractNumId="2" w15:restartNumberingAfterBreak="0">
+  <w:abstractNum w:abstractNumId="3" w15:restartNumberingAfterBreak="0">
+    <w:nsid w:val="38752038"/>
+    <w:multiLevelType w:val="hybridMultilevel"/>
+    <w:tmpl w:val="56BE1404"/>
+    <w:lvl w:ilvl="0" w:tplc="04090001">
+      <w:start w:val="1"/>
+      <w:numFmt w:val="bullet"/>
+      <w:lvlText w:val=""/>
+      <w:lvlJc w:val="left"/>
+      <w:pPr>
+        <w:ind w:left="360" w:hanging="360"/>
+      </w:pPr>
+      <w:rPr>
+        <w:rFonts w:ascii="Symbol" w:hAnsi="Symbol" w:hint="default"/>
+      </w:rPr>
+    </w:lvl>
+    <w:lvl w:ilvl="1" w:tplc="04090003" w:tentative="1">
+      <w:start w:val="1"/>
+      <w:numFmt w:val="bullet"/>
+      <w:lvlText w:val="o"/>
+      <w:lvlJc w:val="left"/>
+      <w:pPr>
+        <w:ind w:left="1080" w:hanging="360"/>
+      </w:pPr>
+      <w:rPr>
+        <w:rFonts w:ascii="Courier New" w:hAnsi="Courier New" w:cs="Courier New" w:hint="default"/>
+      </w:rPr>
+    </w:lvl>
+    <w:lvl w:ilvl="2" w:tplc="04090005" w:tentative="1">
+      <w:start w:val="1"/>
+      <w:numFmt w:val="bullet"/>
+      <w:lvlText w:val=""/>
+      <w:lvlJc w:val="left"/>
+      <w:pPr>
+        <w:ind w:left="1800" w:hanging="360"/>
+      </w:pPr>
+      <w:rPr>
+        <w:rFonts w:ascii="Wingdings" w:hAnsi="Wingdings" w:hint="default"/>
+      </w:rPr>
+    </w:lvl>
+    <w:lvl w:ilvl="3" w:tplc="04090001" w:tentative="1">
+      <w:start w:val="1"/>
+      <w:numFmt w:val="bullet"/>
+      <w:lvlText w:val=""/>
+      <w:lvlJc w:val="left"/>
+      <w:pPr>
+        <w:ind w:left="2520" w:hanging="360"/>
+      </w:pPr>
+      <w:rPr>
+        <w:rFonts w:ascii="Symbol" w:hAnsi="Symbol" w:hint="default"/>
+      </w:rPr>
+    </w:lvl>
+    <w:lvl w:ilvl="4" w:tplc="04090003" w:tentative="1">
+      <w:start w:val="1"/>
+      <w:numFmt w:val="bullet"/>
+      <w:lvlText w:val="o"/>
+      <w:lvlJc w:val="left"/>
+      <w:pPr>
+        <w:ind w:left="3240" w:hanging="360"/>
+      </w:pPr>
+      <w:rPr>
+        <w:rFonts w:ascii="Courier New" w:hAnsi="Courier New" w:cs="Courier New" w:hint="default"/>
+      </w:rPr>
+    </w:lvl>
+    <w:lvl w:ilvl="5" w:tplc="04090005" w:tentative="1">
+      <w:start w:val="1"/>
+      <w:numFmt w:val="bullet"/>
+      <w:lvlText w:val=""/>
+      <w:lvlJc w:val="left"/>
+      <w:pPr>
+        <w:ind w:left="3960" w:hanging="360"/>
+      </w:pPr>
+      <w:rPr>
+        <w:rFonts w:ascii="Wingdings" w:hAnsi="Wingdings" w:hint="default"/>
+      </w:rPr>
+    </w:lvl>
+    <w:lvl w:ilvl="6" w:tplc="04090001" w:tentative="1">
+      <w:start w:val="1"/>
+      <w:numFmt w:val="bullet"/>
+      <w:lvlText w:val=""/>
+      <w:lvlJc w:val="left"/>
+      <w:pPr>
+        <w:ind w:left="4680" w:hanging="360"/>
+      </w:pPr>
+      <w:rPr>
+        <w:rFonts w:ascii="Symbol" w:hAnsi="Symbol" w:hint="default"/>
+      </w:rPr>
+    </w:lvl>
+    <w:lvl w:ilvl="7" w:tplc="04090003" w:tentative="1">
+      <w:start w:val="1"/>
+      <w:numFmt w:val="bullet"/>
+      <w:lvlText w:val="o"/>
+      <w:lvlJc w:val="left"/>
+      <w:pPr>
+        <w:ind w:left="5400" w:hanging="360"/>
+      </w:pPr>
+      <w:rPr>
+        <w:rFonts w:ascii="Courier New" w:hAnsi="Courier New" w:cs="Courier New" w:hint="default"/>
+      </w:rPr>
+    </w:lvl>
+    <w:lvl w:ilvl="8" w:tplc="04090005" w:tentative="1">
+      <w:start w:val="1"/>
+      <w:numFmt w:val="bullet"/>
+      <w:lvlText w:val=""/>
+      <w:lvlJc w:val="left"/>
+      <w:pPr>
+        <w:ind w:left="6120" w:hanging="360"/>
+      </w:pPr>
+      <w:rPr>
+        <w:rFonts w:ascii="Wingdings" w:hAnsi="Wingdings" w:hint="default"/>
+      </w:rPr>
+    </w:lvl>
+  </w:abstractNum>
+  <w:abstractNum w:abstractNumId="4" w15:restartNumberingAfterBreak="0">
     <w:nsid w:val="63992304"/>
     <w:multiLevelType w:val="hybridMultilevel"/>
     <w:tmpl w:val="F7368BE8"/>
@@ -3605,7 +3969,7 @@
       </w:rPr>
     </w:lvl>
   </w:abstractNum>
-  <w:abstractNum w:abstractNumId="3" w15:restartNumberingAfterBreak="0">
+  <w:abstractNum w:abstractNumId="5" w15:restartNumberingAfterBreak="0">
     <w:nsid w:val="6A46596B"/>
     <w:multiLevelType w:val="hybridMultilevel"/>
     <w:tmpl w:val="FCAE57D8"/>
@@ -3721,13 +4085,19 @@
     <w:abstractNumId w:val="0"/>
   </w:num>
   <w:num w:numId="2" w16cid:durableId="812454703">
+    <w:abstractNumId w:val="4"/>
+  </w:num>
+  <w:num w:numId="3" w16cid:durableId="1464888048">
     <w:abstractNumId w:val="2"/>
   </w:num>
-  <w:num w:numId="3" w16cid:durableId="1464888048">
+  <w:num w:numId="4" w16cid:durableId="749471104">
+    <w:abstractNumId w:val="5"/>
+  </w:num>
+  <w:num w:numId="5" w16cid:durableId="289360181">
+    <w:abstractNumId w:val="3"/>
+  </w:num>
+  <w:num w:numId="6" w16cid:durableId="1112552454">
     <w:abstractNumId w:val="1"/>
-  </w:num>
-  <w:num w:numId="4" w16cid:durableId="749471104">
-    <w:abstractNumId w:val="3"/>
   </w:num>
 </w:numbering>
 </file>
@@ -4329,7 +4699,6 @@
   <w:style w:type="character" w:default="1" w:styleId="DefaultParagraphFont">
     <w:name w:val="Default Paragraph Font"/>
     <w:uiPriority w:val="1"/>
-    <w:semiHidden/>
     <w:unhideWhenUsed/>
   </w:style>
   <w:style w:type="table" w:default="1" w:styleId="TableNormal">

</xml_diff>